<commit_message>
Better cv's, better jsons
</commit_message>
<xml_diff>
--- a/cv/Tymon_Korański.docx
+++ b/cv/Tymon_Korański.docx
@@ -21,29 +21,7 @@
           <w:sz w:val="36"/>
           <w:szCs w:val="36"/>
         </w:rPr>
-        <w:t xml:space="preserve">Tymon </w:t>
-      </w:r>
-      <w:proofErr w:type="spellStart"/>
-      <w:r>
-        <w:rPr>
-          <w:rFonts w:ascii="Arial" w:hAnsi="Arial" w:cs="Arial"/>
-          <w:b/>
-          <w:color w:val="4472C4" w:themeColor="accent5"/>
-          <w:sz w:val="36"/>
-          <w:szCs w:val="36"/>
-        </w:rPr>
-        <w:t>Korański</w:t>
-      </w:r>
-      <w:proofErr w:type="spellEnd"/>
-      <w:r>
-        <w:rPr>
-          <w:rFonts w:ascii="Arial" w:hAnsi="Arial" w:cs="Arial"/>
-          <w:b/>
-          <w:color w:val="4472C4" w:themeColor="accent5"/>
-          <w:sz w:val="36"/>
-          <w:szCs w:val="36"/>
-        </w:rPr>
-        <w:t xml:space="preserve"> </w:t>
+        <w:t xml:space="preserve">Tymon Korański </w:t>
       </w:r>
     </w:p>
     <w:p>
@@ -95,14 +73,6 @@
         </w:rPr>
         <w:t xml:space="preserve">tymon.koranski@zielonykrag.org </w:t>
       </w:r>
-    </w:p>
-    <w:p>
-      <w:pPr>
-        <w:spacing w:after="0" w:line="240" w:lineRule="auto"/>
-        <w:rPr>
-          <w:rFonts w:ascii="Arial" w:hAnsi="Arial" w:cs="Arial"/>
-        </w:rPr>
-      </w:pPr>
     </w:p>
     <w:p>
       <w:pPr>
@@ -186,7 +156,6 @@
           <w:szCs w:val="24"/>
         </w:rPr>
       </w:pPr>
-      <w:proofErr w:type="spellStart"/>
       <w:r>
         <w:rPr>
           <w:rFonts w:ascii="Arial" w:hAnsi="Arial" w:cs="Arial"/>
@@ -195,31 +164,8 @@
           <w:sz w:val="24"/>
           <w:szCs w:val="24"/>
         </w:rPr>
-        <w:t>Doświadczenie</w:t>
-      </w:r>
-      <w:proofErr w:type="spellEnd"/>
-      <w:r>
-        <w:rPr>
-          <w:rFonts w:ascii="Arial" w:hAnsi="Arial" w:cs="Arial"/>
-          <w:b/>
-          <w:color w:val="0070C0"/>
-          <w:sz w:val="24"/>
-          <w:szCs w:val="24"/>
-        </w:rPr>
-        <w:t xml:space="preserve"> </w:t>
-      </w:r>
-      <w:proofErr w:type="spellStart"/>
-      <w:r>
-        <w:rPr>
-          <w:rFonts w:ascii="Arial" w:hAnsi="Arial" w:cs="Arial"/>
-          <w:b/>
-          <w:color w:val="0070C0"/>
-          <w:sz w:val="24"/>
-          <w:szCs w:val="24"/>
-        </w:rPr>
-        <w:t>zawodowe</w:t>
-      </w:r>
-      <w:proofErr w:type="spellEnd"/>
+        <w:t>Doświadczenie zawodowe</w:t>
+      </w:r>
     </w:p>
     <w:p>
       <w:pPr>
@@ -326,7 +272,7 @@
     </w:p>
     <w:p>
       <w:pPr>
-        <w:pStyle w:val="ListParagraph"/>
+        <w:pStyle w:val="Akapitzlist"/>
         <w:numPr>
           <w:ilvl w:val="0"/>
           <w:numId w:val="3"/>
@@ -351,7 +297,7 @@
     </w:p>
     <w:p>
       <w:pPr>
-        <w:pStyle w:val="ListParagraph"/>
+        <w:pStyle w:val="Akapitzlist"/>
         <w:numPr>
           <w:ilvl w:val="0"/>
           <w:numId w:val="3"/>
@@ -376,7 +322,7 @@
     </w:p>
     <w:p>
       <w:pPr>
-        <w:pStyle w:val="ListParagraph"/>
+        <w:pStyle w:val="Akapitzlist"/>
         <w:numPr>
           <w:ilvl w:val="0"/>
           <w:numId w:val="3"/>
@@ -401,7 +347,7 @@
     </w:p>
     <w:p>
       <w:pPr>
-        <w:pStyle w:val="ListParagraph"/>
+        <w:pStyle w:val="Akapitzlist"/>
         <w:numPr>
           <w:ilvl w:val="0"/>
           <w:numId w:val="3"/>
@@ -533,7 +479,7 @@
     </w:p>
     <w:p>
       <w:pPr>
-        <w:pStyle w:val="ListParagraph"/>
+        <w:pStyle w:val="Akapitzlist"/>
         <w:numPr>
           <w:ilvl w:val="0"/>
           <w:numId w:val="8"/>
@@ -558,7 +504,7 @@
     </w:p>
     <w:p>
       <w:pPr>
-        <w:pStyle w:val="ListParagraph"/>
+        <w:pStyle w:val="Akapitzlist"/>
         <w:numPr>
           <w:ilvl w:val="0"/>
           <w:numId w:val="8"/>
@@ -583,7 +529,7 @@
     </w:p>
     <w:p>
       <w:pPr>
-        <w:pStyle w:val="ListParagraph"/>
+        <w:pStyle w:val="Akapitzlist"/>
         <w:numPr>
           <w:ilvl w:val="0"/>
           <w:numId w:val="8"/>
@@ -643,17 +589,7 @@
           <w:szCs w:val="24"/>
           <w:lang w:val="pl-PL"/>
         </w:rPr>
-        <w:t>Dolina Szmaragdowego Lasu</w:t>
-      </w:r>
-      <w:r>
-        <w:rPr>
-          <w:rFonts w:ascii="Arial" w:hAnsi="Arial" w:cs="Arial"/>
-          <w:b/>
-          <w:sz w:val="24"/>
-          <w:szCs w:val="24"/>
-          <w:lang w:val="pl-PL"/>
-        </w:rPr>
-        <w:t xml:space="preserve">, </w:t>
+        <w:t xml:space="preserve">Dolina Szmaragdowego Lasu, </w:t>
       </w:r>
       <w:r>
         <w:rPr>
@@ -673,39 +609,12 @@
           <w:lang w:val="pl-PL"/>
         </w:rPr>
         <w:tab/>
-        <w:t>201</w:t>
-      </w:r>
-      <w:r>
-        <w:rPr>
-          <w:rFonts w:ascii="Arial" w:hAnsi="Arial" w:cs="Arial"/>
-          <w:sz w:val="24"/>
-          <w:szCs w:val="24"/>
-          <w:lang w:val="pl-PL"/>
-        </w:rPr>
-        <w:t>0</w:t>
-      </w:r>
-      <w:r>
-        <w:rPr>
-          <w:rFonts w:ascii="Arial" w:hAnsi="Arial" w:cs="Arial"/>
-          <w:sz w:val="24"/>
-          <w:szCs w:val="24"/>
-          <w:lang w:val="pl-PL"/>
-        </w:rPr>
-        <w:t xml:space="preserve"> – 201</w:t>
-      </w:r>
-      <w:r>
-        <w:rPr>
-          <w:rFonts w:ascii="Arial" w:hAnsi="Arial" w:cs="Arial"/>
-          <w:sz w:val="24"/>
-          <w:szCs w:val="24"/>
-          <w:lang w:val="pl-PL"/>
-        </w:rPr>
-        <w:t>3</w:t>
-      </w:r>
-    </w:p>
-    <w:p>
-      <w:pPr>
-        <w:pStyle w:val="ListParagraph"/>
+        <w:t>2010 – 2013</w:t>
+      </w:r>
+    </w:p>
+    <w:p>
+      <w:pPr>
+        <w:pStyle w:val="Akapitzlist"/>
         <w:numPr>
           <w:ilvl w:val="0"/>
           <w:numId w:val="8"/>
@@ -730,7 +639,7 @@
     </w:p>
     <w:p>
       <w:pPr>
-        <w:pStyle w:val="ListParagraph"/>
+        <w:pStyle w:val="Akapitzlist"/>
         <w:numPr>
           <w:ilvl w:val="0"/>
           <w:numId w:val="8"/>
@@ -755,7 +664,7 @@
     </w:p>
     <w:p>
       <w:pPr>
-        <w:pStyle w:val="ListParagraph"/>
+        <w:pStyle w:val="Akapitzlist"/>
         <w:numPr>
           <w:ilvl w:val="0"/>
           <w:numId w:val="8"/>
@@ -808,7 +717,6 @@
           <w:szCs w:val="24"/>
         </w:rPr>
       </w:pPr>
-      <w:proofErr w:type="spellStart"/>
       <w:r>
         <w:rPr>
           <w:rFonts w:ascii="Arial" w:hAnsi="Arial" w:cs="Arial"/>
@@ -819,7 +727,6 @@
         </w:rPr>
         <w:t>Wykształcenie</w:t>
       </w:r>
-      <w:proofErr w:type="spellEnd"/>
     </w:p>
     <w:p>
       <w:pPr>
@@ -960,7 +867,6 @@
           <w:szCs w:val="24"/>
         </w:rPr>
       </w:pPr>
-      <w:proofErr w:type="spellStart"/>
       <w:r>
         <w:rPr>
           <w:rFonts w:ascii="Arial" w:hAnsi="Arial" w:cs="Arial"/>
@@ -972,27 +878,30 @@
         </w:rPr>
         <w:t>Umiejętności</w:t>
       </w:r>
-      <w:proofErr w:type="spellEnd"/>
-    </w:p>
-    <w:p>
-      <w:pPr>
-        <w:spacing w:after="0" w:line="240" w:lineRule="auto"/>
-        <w:rPr>
-          <w:rFonts w:ascii="Arial" w:hAnsi="Arial" w:cs="Arial"/>
-          <w:sz w:val="24"/>
-          <w:szCs w:val="24"/>
-        </w:rPr>
-      </w:pPr>
-    </w:p>
-    <w:p>
-      <w:pPr>
+    </w:p>
+    <w:p>
+      <w:pPr>
+        <w:spacing w:after="0" w:line="240" w:lineRule="auto"/>
+        <w:rPr>
+          <w:rFonts w:ascii="Arial" w:hAnsi="Arial" w:cs="Arial"/>
+          <w:sz w:val="24"/>
+          <w:szCs w:val="24"/>
+        </w:rPr>
+      </w:pPr>
+    </w:p>
+    <w:p>
+      <w:pPr>
+        <w:pStyle w:val="Akapitzlist"/>
+        <w:numPr>
+          <w:ilvl w:val="0"/>
+          <w:numId w:val="12"/>
+        </w:numPr>
         <w:pBdr>
           <w:bottom w:val="single" w:sz="4" w:space="1" w:color="auto"/>
         </w:pBdr>
         <w:spacing w:after="0" w:line="240" w:lineRule="auto"/>
         <w:rPr>
           <w:rFonts w:ascii="Arial" w:hAnsi="Arial" w:cs="Arial"/>
-          <w:b/>
           <w:sz w:val="24"/>
           <w:szCs w:val="24"/>
           <w:lang w:val="pl-PL"/>
@@ -1007,99 +916,14 @@
         </w:rPr>
         <w:t>Rozpoznawanie i klasyfikacja magicznych stworzeń</w:t>
       </w:r>
-      <w:r>
-        <w:rPr>
-          <w:rFonts w:ascii="Arial" w:hAnsi="Arial" w:cs="Arial"/>
-          <w:sz w:val="24"/>
-          <w:szCs w:val="24"/>
-          <w:lang w:val="pl-PL"/>
-        </w:rPr>
-        <w:t xml:space="preserve"> | </w:t>
-      </w:r>
-      <w:r>
-        <w:rPr>
-          <w:rFonts w:ascii="Arial" w:hAnsi="Arial" w:cs="Arial"/>
-          <w:sz w:val="24"/>
-          <w:szCs w:val="24"/>
-          <w:lang w:val="pl-PL"/>
-        </w:rPr>
-        <w:t xml:space="preserve">Zakładanie zabezpieczeń terenowych i barier ochronnych </w:t>
-      </w:r>
-      <w:r>
-        <w:rPr>
-          <w:rFonts w:ascii="Arial" w:hAnsi="Arial" w:cs="Arial"/>
-          <w:sz w:val="24"/>
-          <w:szCs w:val="24"/>
-          <w:lang w:val="pl-PL"/>
-        </w:rPr>
-        <w:t xml:space="preserve">| </w:t>
-      </w:r>
-      <w:r>
-        <w:rPr>
-          <w:rFonts w:ascii="Arial" w:hAnsi="Arial" w:cs="Arial"/>
-          <w:sz w:val="24"/>
-          <w:szCs w:val="24"/>
-          <w:lang w:val="pl-PL"/>
-        </w:rPr>
-        <w:t xml:space="preserve">Leczenie drobnych ran magicznych </w:t>
-      </w:r>
-      <w:r>
-        <w:rPr>
-          <w:rFonts w:ascii="Arial" w:hAnsi="Arial" w:cs="Arial"/>
-          <w:sz w:val="24"/>
-          <w:szCs w:val="24"/>
-          <w:lang w:val="pl-PL"/>
-        </w:rPr>
-        <w:t xml:space="preserve">| </w:t>
-      </w:r>
-      <w:r>
-        <w:rPr>
-          <w:rFonts w:ascii="Arial" w:hAnsi="Arial" w:cs="Arial"/>
-          <w:sz w:val="24"/>
-          <w:szCs w:val="24"/>
-          <w:lang w:val="pl-PL"/>
-        </w:rPr>
-        <w:t xml:space="preserve">Praca fizyczna w trudnych warunkach </w:t>
-      </w:r>
-      <w:r>
-        <w:rPr>
-          <w:rFonts w:ascii="Arial" w:hAnsi="Arial" w:cs="Arial"/>
-          <w:sz w:val="24"/>
-          <w:szCs w:val="24"/>
-          <w:lang w:val="pl-PL"/>
-        </w:rPr>
-        <w:t xml:space="preserve">| </w:t>
-      </w:r>
-      <w:r>
-        <w:rPr>
-          <w:rFonts w:ascii="Arial" w:hAnsi="Arial" w:cs="Arial"/>
-          <w:sz w:val="24"/>
-          <w:szCs w:val="24"/>
-          <w:lang w:val="pl-PL"/>
-        </w:rPr>
-        <w:t xml:space="preserve">Obsługa narzędzi runicznych i zaklęć natury </w:t>
-      </w:r>
-      <w:r>
-        <w:rPr>
-          <w:rFonts w:ascii="Arial" w:hAnsi="Arial" w:cs="Arial"/>
-          <w:sz w:val="24"/>
-          <w:szCs w:val="24"/>
-          <w:lang w:val="pl-PL"/>
-        </w:rPr>
-        <w:t xml:space="preserve">| </w:t>
-      </w:r>
-      <w:r>
-        <w:rPr>
-          <w:rFonts w:ascii="Arial" w:hAnsi="Arial" w:cs="Arial"/>
-          <w:sz w:val="24"/>
-          <w:szCs w:val="24"/>
-          <w:lang w:val="pl-PL"/>
-        </w:rPr>
-        <w:t xml:space="preserve">Komunikacja z istotami leśnymi </w:t>
-      </w:r>
-    </w:p>
-    <w:p>
-      <w:pPr>
+    </w:p>
+    <w:p>
+      <w:pPr>
+        <w:pStyle w:val="Akapitzlist"/>
+        <w:numPr>
+          <w:ilvl w:val="0"/>
+          <w:numId w:val="12"/>
+        </w:numPr>
         <w:pBdr>
           <w:bottom w:val="single" w:sz="4" w:space="1" w:color="auto"/>
         </w:pBdr>
@@ -1111,22 +935,219 @@
           <w:lang w:val="pl-PL"/>
         </w:rPr>
       </w:pPr>
-    </w:p>
-    <w:p>
-      <w:pPr>
+      <w:r>
+        <w:rPr>
+          <w:rFonts w:ascii="Arial" w:hAnsi="Arial" w:cs="Arial"/>
+          <w:sz w:val="24"/>
+          <w:szCs w:val="24"/>
+          <w:lang w:val="pl-PL"/>
+        </w:rPr>
+        <w:t>Zabezpieczenia leśne</w:t>
+      </w:r>
+      <w:r>
+        <w:rPr>
+          <w:rFonts w:ascii="Arial" w:hAnsi="Arial" w:cs="Arial"/>
+          <w:sz w:val="24"/>
+          <w:szCs w:val="24"/>
+          <w:lang w:val="pl-PL"/>
+        </w:rPr>
+        <w:t xml:space="preserve"> </w:t>
+      </w:r>
+    </w:p>
+    <w:p>
+      <w:pPr>
+        <w:pStyle w:val="Akapitzlist"/>
+        <w:numPr>
+          <w:ilvl w:val="0"/>
+          <w:numId w:val="12"/>
+        </w:numPr>
         <w:pBdr>
           <w:bottom w:val="single" w:sz="4" w:space="1" w:color="auto"/>
         </w:pBdr>
         <w:spacing w:after="0" w:line="240" w:lineRule="auto"/>
         <w:rPr>
           <w:rFonts w:ascii="Arial" w:hAnsi="Arial" w:cs="Arial"/>
+          <w:sz w:val="24"/>
+          <w:szCs w:val="24"/>
+          <w:lang w:val="pl-PL"/>
+        </w:rPr>
+      </w:pPr>
+      <w:r>
+        <w:rPr>
+          <w:rFonts w:ascii="Arial" w:hAnsi="Arial" w:cs="Arial"/>
+          <w:sz w:val="24"/>
+          <w:szCs w:val="24"/>
+          <w:lang w:val="pl-PL"/>
+        </w:rPr>
+        <w:t>Zbieranie ingrediencji w trudnych warunkach atmosferycznych</w:t>
+      </w:r>
+      <w:r>
+        <w:rPr>
+          <w:rFonts w:ascii="Arial" w:hAnsi="Arial" w:cs="Arial"/>
+          <w:sz w:val="24"/>
+          <w:szCs w:val="24"/>
+          <w:lang w:val="pl-PL"/>
+        </w:rPr>
+        <w:t xml:space="preserve"> </w:t>
+      </w:r>
+    </w:p>
+    <w:p>
+      <w:pPr>
+        <w:pStyle w:val="Akapitzlist"/>
+        <w:numPr>
+          <w:ilvl w:val="0"/>
+          <w:numId w:val="12"/>
+        </w:numPr>
+        <w:pBdr>
+          <w:bottom w:val="single" w:sz="4" w:space="1" w:color="auto"/>
+        </w:pBdr>
+        <w:spacing w:after="0" w:line="240" w:lineRule="auto"/>
+        <w:rPr>
+          <w:rFonts w:ascii="Arial" w:hAnsi="Arial" w:cs="Arial"/>
+          <w:sz w:val="24"/>
+          <w:szCs w:val="24"/>
+          <w:lang w:val="pl-PL"/>
+        </w:rPr>
+      </w:pPr>
+      <w:r>
+        <w:rPr>
+          <w:rFonts w:ascii="Arial" w:hAnsi="Arial" w:cs="Arial"/>
+          <w:sz w:val="24"/>
+          <w:szCs w:val="24"/>
+          <w:lang w:val="pl-PL"/>
+        </w:rPr>
+        <w:t>Praca fizyczna</w:t>
+      </w:r>
+    </w:p>
+    <w:p>
+      <w:pPr>
+        <w:pStyle w:val="Akapitzlist"/>
+        <w:numPr>
+          <w:ilvl w:val="0"/>
+          <w:numId w:val="12"/>
+        </w:numPr>
+        <w:pBdr>
+          <w:bottom w:val="single" w:sz="4" w:space="1" w:color="auto"/>
+        </w:pBdr>
+        <w:spacing w:after="0" w:line="240" w:lineRule="auto"/>
+        <w:rPr>
+          <w:rFonts w:ascii="Arial" w:hAnsi="Arial" w:cs="Arial"/>
+          <w:sz w:val="24"/>
+          <w:szCs w:val="24"/>
+          <w:lang w:val="pl-PL"/>
+        </w:rPr>
+      </w:pPr>
+      <w:r>
+        <w:rPr>
+          <w:rFonts w:ascii="Arial" w:hAnsi="Arial" w:cs="Arial"/>
+          <w:sz w:val="24"/>
+          <w:szCs w:val="24"/>
+          <w:lang w:val="pl-PL"/>
+        </w:rPr>
+        <w:t>Leczenie magicznych stworzeń</w:t>
+      </w:r>
+    </w:p>
+    <w:p>
+      <w:pPr>
+        <w:pStyle w:val="Akapitzlist"/>
+        <w:numPr>
+          <w:ilvl w:val="0"/>
+          <w:numId w:val="12"/>
+        </w:numPr>
+        <w:pBdr>
+          <w:bottom w:val="single" w:sz="4" w:space="1" w:color="auto"/>
+        </w:pBdr>
+        <w:spacing w:after="0" w:line="240" w:lineRule="auto"/>
+        <w:rPr>
+          <w:rFonts w:ascii="Arial" w:hAnsi="Arial" w:cs="Arial"/>
+          <w:b/>
+          <w:sz w:val="24"/>
+          <w:szCs w:val="24"/>
+          <w:lang w:val="pl-PL"/>
+        </w:rPr>
+      </w:pPr>
+      <w:r>
+        <w:rPr>
+          <w:rFonts w:ascii="Arial" w:hAnsi="Arial" w:cs="Arial"/>
+          <w:sz w:val="24"/>
+          <w:szCs w:val="24"/>
+          <w:lang w:val="pl-PL"/>
+        </w:rPr>
+        <w:t>Ogrodzenia antymagiczne</w:t>
+      </w:r>
+    </w:p>
+    <w:p>
+      <w:pPr>
+        <w:pStyle w:val="Akapitzlist"/>
+        <w:numPr>
+          <w:ilvl w:val="0"/>
+          <w:numId w:val="12"/>
+        </w:numPr>
+        <w:pBdr>
+          <w:bottom w:val="single" w:sz="4" w:space="1" w:color="auto"/>
+        </w:pBdr>
+        <w:spacing w:after="0" w:line="240" w:lineRule="auto"/>
+        <w:rPr>
+          <w:rFonts w:ascii="Arial" w:hAnsi="Arial" w:cs="Arial"/>
+          <w:b/>
+          <w:sz w:val="24"/>
+          <w:szCs w:val="24"/>
+          <w:lang w:val="pl-PL"/>
+        </w:rPr>
+      </w:pPr>
+      <w:r>
+        <w:rPr>
+          <w:rFonts w:ascii="Arial" w:hAnsi="Arial" w:cs="Arial"/>
+          <w:sz w:val="24"/>
+          <w:szCs w:val="24"/>
+          <w:lang w:val="pl-PL"/>
+        </w:rPr>
+        <w:t>Zielarstwo</w:t>
+      </w:r>
+    </w:p>
+    <w:p>
+      <w:pPr>
+        <w:pStyle w:val="Akapitzlist"/>
+        <w:numPr>
+          <w:ilvl w:val="0"/>
+          <w:numId w:val="12"/>
+        </w:numPr>
+        <w:pBdr>
+          <w:bottom w:val="single" w:sz="4" w:space="1" w:color="auto"/>
+        </w:pBdr>
+        <w:spacing w:after="0" w:line="240" w:lineRule="auto"/>
+        <w:rPr>
+          <w:rFonts w:ascii="Arial" w:hAnsi="Arial" w:cs="Arial"/>
+          <w:b/>
+          <w:sz w:val="24"/>
+          <w:szCs w:val="24"/>
+          <w:lang w:val="pl-PL"/>
+        </w:rPr>
+      </w:pPr>
+      <w:r>
+        <w:rPr>
+          <w:rFonts w:ascii="Arial" w:hAnsi="Arial" w:cs="Arial"/>
+          <w:sz w:val="24"/>
+          <w:szCs w:val="24"/>
+          <w:lang w:val="pl-PL"/>
+        </w:rPr>
+        <w:t>Miksturoznawstwo</w:t>
+      </w:r>
+    </w:p>
+    <w:p>
+      <w:pPr>
+        <w:pBdr>
+          <w:bottom w:val="single" w:sz="4" w:space="1" w:color="auto"/>
+        </w:pBdr>
+        <w:spacing w:after="0" w:line="240" w:lineRule="auto"/>
+        <w:rPr>
+          <w:rFonts w:ascii="Arial" w:hAnsi="Arial" w:cs="Arial"/>
           <w:b/>
           <w:color w:val="0070C0"/>
           <w:sz w:val="24"/>
           <w:szCs w:val="24"/>
         </w:rPr>
       </w:pPr>
-      <w:proofErr w:type="spellStart"/>
       <w:r>
         <w:rPr>
           <w:rFonts w:ascii="Arial" w:hAnsi="Arial" w:cs="Arial"/>
@@ -1137,7 +1158,6 @@
         </w:rPr>
         <w:t>Języki</w:t>
       </w:r>
-      <w:proofErr w:type="spellEnd"/>
     </w:p>
     <w:p>
       <w:pPr>
@@ -1175,43 +1195,7 @@
           <w:szCs w:val="24"/>
           <w:lang w:val="pl-PL"/>
         </w:rPr>
-        <w:t>Wspólny - biegły</w:t>
-      </w:r>
-      <w:r>
-        <w:rPr>
-          <w:rFonts w:ascii="Arial" w:hAnsi="Arial" w:cs="Arial"/>
-          <w:sz w:val="24"/>
-          <w:szCs w:val="24"/>
-          <w:lang w:val="pl-PL"/>
-        </w:rPr>
-        <w:t xml:space="preserve"> | </w:t>
-      </w:r>
-      <w:r>
-        <w:rPr>
-          <w:rFonts w:ascii="Arial" w:hAnsi="Arial" w:cs="Arial"/>
-          <w:sz w:val="24"/>
-          <w:szCs w:val="24"/>
-          <w:lang w:val="pl-PL"/>
-        </w:rPr>
-        <w:t xml:space="preserve">Runiczny natury – średniozaawansowany </w:t>
-      </w:r>
-      <w:r>
-        <w:rPr>
-          <w:rFonts w:ascii="Arial" w:hAnsi="Arial" w:cs="Arial"/>
-          <w:sz w:val="24"/>
-          <w:szCs w:val="24"/>
-          <w:lang w:val="pl-PL"/>
-        </w:rPr>
-        <w:t xml:space="preserve">| </w:t>
-      </w:r>
-      <w:r>
-        <w:rPr>
-          <w:rFonts w:ascii="Arial" w:hAnsi="Arial" w:cs="Arial"/>
-          <w:sz w:val="24"/>
-          <w:szCs w:val="24"/>
-          <w:lang w:val="pl-PL"/>
-        </w:rPr>
-        <w:t xml:space="preserve">Staroelficki – podstawowy </w:t>
+        <w:t xml:space="preserve">Wspólny - biegły | Runiczny natury – średniozaawansowany | Staroelficki – podstawowy </w:t>
       </w:r>
     </w:p>
     <w:p>
@@ -1279,7 +1263,7 @@
 <w:ftr xmlns:wpc="http://schemas.microsoft.com/office/word/2010/wordprocessingCanvas" xmlns:cx="http://schemas.microsoft.com/office/drawing/2014/chartex" xmlns:cx1="http://schemas.microsoft.com/office/drawing/2015/9/8/chartex" xmlns:cx2="http://schemas.microsoft.com/office/drawing/2015/10/21/chartex" xmlns:cx3="http://schemas.microsoft.com/office/drawing/2016/5/9/chartex" xmlns:cx4="http://schemas.microsoft.com/office/drawing/2016/5/10/chartex" xmlns:cx5="http://schemas.microsoft.com/office/drawing/2016/5/11/chartex" xmlns:cx6="http://schemas.microsoft.com/office/drawing/2016/5/12/chartex" xmlns:cx7="http://schemas.microsoft.com/office/drawing/2016/5/13/chartex" xmlns:cx8="http://schemas.microsoft.com/office/drawing/2016/5/14/chartex" xmlns:mc="http://schemas.openxmlformats.org/markup-compatibility/2006" xmlns:aink="http://schemas.microsoft.com/office/drawing/2016/ink" xmlns:am3d="http://schemas.microsoft.com/office/drawing/2017/model3d" xmlns:o="urn:schemas-microsoft-com:office:office" xmlns:oel="http://schemas.microsoft.com/office/2019/extlst" xmlns:r="http://schemas.openxmlformats.org/officeDocument/2006/relationships" xmlns:m="http://schemas.openxmlformats.org/officeDocument/2006/math" xmlns:v="urn:schemas-microsoft-com:vml" xmlns:wp14="http://schemas.microsoft.com/office/word/2010/wordprocessingDrawing" xmlns:wp="http://schemas.openxmlformats.org/drawingml/2006/wordprocessingDrawing" xmlns:w10="urn:schemas-microsoft-com:office:word" xmlns:w="http://schemas.openxmlformats.org/wordprocessingml/2006/main" xmlns:w14="http://schemas.microsoft.com/office/word/2010/wordml" xmlns:w15="http://schemas.microsoft.com/office/word/2012/wordml" xmlns:w16cex="http://schemas.microsoft.com/office/word/2018/wordml/cex" xmlns:w16cid="http://schemas.microsoft.com/office/word/2016/wordml/cid" xmlns:w16="http://schemas.microsoft.com/office/word/2018/wordml" xmlns:w16du="http://schemas.microsoft.com/office/word/2023/wordml/word16du" xmlns:w16sdtdh="http://schemas.microsoft.com/office/word/2020/wordml/sdtdatahash" xmlns:w16sdtfl="http://schemas.microsoft.com/office/word/2024/wordml/sdtformatlock" xmlns:w16se="http://schemas.microsoft.com/office/word/2015/wordml/symex" xmlns:wpg="http://schemas.microsoft.com/office/word/2010/wordprocessingGroup" xmlns:wpi="http://schemas.microsoft.com/office/word/2010/wordprocessingInk" xmlns:wne="http://schemas.microsoft.com/office/word/2006/wordml" xmlns:wps="http://schemas.microsoft.com/office/word/2010/wordprocessingShape" mc:Ignorable="w14 w15 w16se w16cid w16 w16cex w16sdtdh w16sdtfl w16du wp14">
   <w:p>
     <w:pPr>
-      <w:pStyle w:val="Footer"/>
+      <w:pStyle w:val="Stopka"/>
       <w:rPr>
         <w:lang w:val="pl-PL"/>
       </w:rPr>
@@ -2340,6 +2324,119 @@
     </w:lvl>
   </w:abstractNum>
   <w:abstractNum w:abstractNumId="9" w15:restartNumberingAfterBreak="0">
+    <w:nsid w:val="6D9D66EA"/>
+    <w:multiLevelType w:val="hybridMultilevel"/>
+    <w:tmpl w:val="B2D8BDE6"/>
+    <w:lvl w:ilvl="0" w:tplc="04150001">
+      <w:start w:val="1"/>
+      <w:numFmt w:val="bullet"/>
+      <w:lvlText w:val=""/>
+      <w:lvlJc w:val="left"/>
+      <w:pPr>
+        <w:ind w:left="720" w:hanging="360"/>
+      </w:pPr>
+      <w:rPr>
+        <w:rFonts w:ascii="Symbol" w:hAnsi="Symbol" w:hint="default"/>
+      </w:rPr>
+    </w:lvl>
+    <w:lvl w:ilvl="1" w:tplc="04150003" w:tentative="1">
+      <w:start w:val="1"/>
+      <w:numFmt w:val="bullet"/>
+      <w:lvlText w:val="o"/>
+      <w:lvlJc w:val="left"/>
+      <w:pPr>
+        <w:ind w:left="1440" w:hanging="360"/>
+      </w:pPr>
+      <w:rPr>
+        <w:rFonts w:ascii="Courier New" w:hAnsi="Courier New" w:cs="Courier New" w:hint="default"/>
+      </w:rPr>
+    </w:lvl>
+    <w:lvl w:ilvl="2" w:tplc="04150005" w:tentative="1">
+      <w:start w:val="1"/>
+      <w:numFmt w:val="bullet"/>
+      <w:lvlText w:val=""/>
+      <w:lvlJc w:val="left"/>
+      <w:pPr>
+        <w:ind w:left="2160" w:hanging="360"/>
+      </w:pPr>
+      <w:rPr>
+        <w:rFonts w:ascii="Wingdings" w:hAnsi="Wingdings" w:hint="default"/>
+      </w:rPr>
+    </w:lvl>
+    <w:lvl w:ilvl="3" w:tplc="04150001" w:tentative="1">
+      <w:start w:val="1"/>
+      <w:numFmt w:val="bullet"/>
+      <w:lvlText w:val=""/>
+      <w:lvlJc w:val="left"/>
+      <w:pPr>
+        <w:ind w:left="2880" w:hanging="360"/>
+      </w:pPr>
+      <w:rPr>
+        <w:rFonts w:ascii="Symbol" w:hAnsi="Symbol" w:hint="default"/>
+      </w:rPr>
+    </w:lvl>
+    <w:lvl w:ilvl="4" w:tplc="04150003" w:tentative="1">
+      <w:start w:val="1"/>
+      <w:numFmt w:val="bullet"/>
+      <w:lvlText w:val="o"/>
+      <w:lvlJc w:val="left"/>
+      <w:pPr>
+        <w:ind w:left="3600" w:hanging="360"/>
+      </w:pPr>
+      <w:rPr>
+        <w:rFonts w:ascii="Courier New" w:hAnsi="Courier New" w:cs="Courier New" w:hint="default"/>
+      </w:rPr>
+    </w:lvl>
+    <w:lvl w:ilvl="5" w:tplc="04150005" w:tentative="1">
+      <w:start w:val="1"/>
+      <w:numFmt w:val="bullet"/>
+      <w:lvlText w:val=""/>
+      <w:lvlJc w:val="left"/>
+      <w:pPr>
+        <w:ind w:left="4320" w:hanging="360"/>
+      </w:pPr>
+      <w:rPr>
+        <w:rFonts w:ascii="Wingdings" w:hAnsi="Wingdings" w:hint="default"/>
+      </w:rPr>
+    </w:lvl>
+    <w:lvl w:ilvl="6" w:tplc="04150001" w:tentative="1">
+      <w:start w:val="1"/>
+      <w:numFmt w:val="bullet"/>
+      <w:lvlText w:val=""/>
+      <w:lvlJc w:val="left"/>
+      <w:pPr>
+        <w:ind w:left="5040" w:hanging="360"/>
+      </w:pPr>
+      <w:rPr>
+        <w:rFonts w:ascii="Symbol" w:hAnsi="Symbol" w:hint="default"/>
+      </w:rPr>
+    </w:lvl>
+    <w:lvl w:ilvl="7" w:tplc="04150003" w:tentative="1">
+      <w:start w:val="1"/>
+      <w:numFmt w:val="bullet"/>
+      <w:lvlText w:val="o"/>
+      <w:lvlJc w:val="left"/>
+      <w:pPr>
+        <w:ind w:left="5760" w:hanging="360"/>
+      </w:pPr>
+      <w:rPr>
+        <w:rFonts w:ascii="Courier New" w:hAnsi="Courier New" w:cs="Courier New" w:hint="default"/>
+      </w:rPr>
+    </w:lvl>
+    <w:lvl w:ilvl="8" w:tplc="04150005" w:tentative="1">
+      <w:start w:val="1"/>
+      <w:numFmt w:val="bullet"/>
+      <w:lvlText w:val=""/>
+      <w:lvlJc w:val="left"/>
+      <w:pPr>
+        <w:ind w:left="6480" w:hanging="360"/>
+      </w:pPr>
+      <w:rPr>
+        <w:rFonts w:ascii="Wingdings" w:hAnsi="Wingdings" w:hint="default"/>
+      </w:rPr>
+    </w:lvl>
+  </w:abstractNum>
+  <w:abstractNum w:abstractNumId="10" w15:restartNumberingAfterBreak="0">
     <w:nsid w:val="7A7D69BF"/>
     <w:multiLevelType w:val="hybridMultilevel"/>
     <w:tmpl w:val="160C4AA6"/>
@@ -2452,7 +2549,7 @@
       </w:rPr>
     </w:lvl>
   </w:abstractNum>
-  <w:abstractNum w:abstractNumId="10" w15:restartNumberingAfterBreak="0">
+  <w:abstractNum w:abstractNumId="11" w15:restartNumberingAfterBreak="0">
     <w:nsid w:val="7C884484"/>
     <w:multiLevelType w:val="hybridMultilevel"/>
     <w:tmpl w:val="9FCE463E"/>
@@ -2566,7 +2663,7 @@
     </w:lvl>
   </w:abstractNum>
   <w:num w:numId="1" w16cid:durableId="129133144">
-    <w:abstractNumId w:val="9"/>
+    <w:abstractNumId w:val="10"/>
   </w:num>
   <w:num w:numId="2" w16cid:durableId="1163087192">
     <w:abstractNumId w:val="2"/>
@@ -2581,7 +2678,7 @@
     <w:abstractNumId w:val="0"/>
   </w:num>
   <w:num w:numId="6" w16cid:durableId="164638021">
-    <w:abstractNumId w:val="10"/>
+    <w:abstractNumId w:val="11"/>
   </w:num>
   <w:num w:numId="7" w16cid:durableId="37778085">
     <w:abstractNumId w:val="4"/>
@@ -2597,6 +2694,9 @@
   </w:num>
   <w:num w:numId="11" w16cid:durableId="1504663174">
     <w:abstractNumId w:val="8"/>
+  </w:num>
+  <w:num w:numId="12" w16cid:durableId="1129469413">
+    <w:abstractNumId w:val="9"/>
   </w:num>
 </w:numbering>
 </file>
@@ -2987,16 +3087,17 @@
     <w:lsdException w:name="Unresolved Mention" w:semiHidden="1" w:unhideWhenUsed="1"/>
     <w:lsdException w:name="Smart Link" w:semiHidden="1" w:unhideWhenUsed="1"/>
   </w:latentStyles>
-  <w:style w:type="paragraph" w:default="1" w:styleId="Normal">
+  <w:style w:type="paragraph" w:default="1" w:styleId="Normalny">
     <w:name w:val="Normal"/>
     <w:qFormat/>
   </w:style>
-  <w:style w:type="character" w:default="1" w:styleId="DefaultParagraphFont">
+  <w:style w:type="character" w:default="1" w:styleId="Domylnaczcionkaakapitu">
     <w:name w:val="Default Paragraph Font"/>
     <w:uiPriority w:val="1"/>
+    <w:semiHidden/>
     <w:unhideWhenUsed/>
   </w:style>
-  <w:style w:type="table" w:default="1" w:styleId="TableNormal">
+  <w:style w:type="table" w:default="1" w:styleId="Standardowy">
     <w:name w:val="Normal Table"/>
     <w:uiPriority w:val="99"/>
     <w:semiHidden/>
@@ -3011,15 +3112,15 @@
       </w:tblCellMar>
     </w:tblPr>
   </w:style>
-  <w:style w:type="numbering" w:default="1" w:styleId="NoList">
+  <w:style w:type="numbering" w:default="1" w:styleId="Bezlisty">
     <w:name w:val="No List"/>
     <w:uiPriority w:val="99"/>
     <w:semiHidden/>
     <w:unhideWhenUsed/>
   </w:style>
-  <w:style w:type="paragraph" w:styleId="ListParagraph">
+  <w:style w:type="paragraph" w:styleId="Akapitzlist">
     <w:name w:val="List Paragraph"/>
-    <w:basedOn w:val="Normal"/>
+    <w:basedOn w:val="Normalny"/>
     <w:uiPriority w:val="34"/>
     <w:qFormat/>
     <w:rsid w:val="00474A1B"/>
@@ -3028,10 +3129,10 @@
       <w:contextualSpacing/>
     </w:pPr>
   </w:style>
-  <w:style w:type="paragraph" w:styleId="Header">
+  <w:style w:type="paragraph" w:styleId="Nagwek">
     <w:name w:val="header"/>
-    <w:basedOn w:val="Normal"/>
-    <w:link w:val="HeaderChar"/>
+    <w:basedOn w:val="Normalny"/>
+    <w:link w:val="NagwekZnak"/>
     <w:uiPriority w:val="99"/>
     <w:unhideWhenUsed/>
     <w:rsid w:val="00472DBA"/>
@@ -3043,17 +3144,17 @@
       <w:spacing w:after="0" w:line="240" w:lineRule="auto"/>
     </w:pPr>
   </w:style>
-  <w:style w:type="character" w:customStyle="1" w:styleId="HeaderChar">
-    <w:name w:val="Header Char"/>
-    <w:basedOn w:val="DefaultParagraphFont"/>
-    <w:link w:val="Header"/>
+  <w:style w:type="character" w:customStyle="1" w:styleId="NagwekZnak">
+    <w:name w:val="Nagłówek Znak"/>
+    <w:basedOn w:val="Domylnaczcionkaakapitu"/>
+    <w:link w:val="Nagwek"/>
     <w:uiPriority w:val="99"/>
     <w:rsid w:val="00472DBA"/>
   </w:style>
-  <w:style w:type="paragraph" w:styleId="Footer">
+  <w:style w:type="paragraph" w:styleId="Stopka">
     <w:name w:val="footer"/>
-    <w:basedOn w:val="Normal"/>
-    <w:link w:val="FooterChar"/>
+    <w:basedOn w:val="Normalny"/>
+    <w:link w:val="StopkaZnak"/>
     <w:uiPriority w:val="99"/>
     <w:unhideWhenUsed/>
     <w:rsid w:val="00472DBA"/>
@@ -3065,17 +3166,17 @@
       <w:spacing w:after="0" w:line="240" w:lineRule="auto"/>
     </w:pPr>
   </w:style>
-  <w:style w:type="character" w:customStyle="1" w:styleId="FooterChar">
-    <w:name w:val="Footer Char"/>
-    <w:basedOn w:val="DefaultParagraphFont"/>
-    <w:link w:val="Footer"/>
+  <w:style w:type="character" w:customStyle="1" w:styleId="StopkaZnak">
+    <w:name w:val="Stopka Znak"/>
+    <w:basedOn w:val="Domylnaczcionkaakapitu"/>
+    <w:link w:val="Stopka"/>
     <w:uiPriority w:val="99"/>
     <w:rsid w:val="00472DBA"/>
   </w:style>
-  <w:style w:type="paragraph" w:styleId="BalloonText">
+  <w:style w:type="paragraph" w:styleId="Tekstdymka">
     <w:name w:val="Balloon Text"/>
-    <w:basedOn w:val="Normal"/>
-    <w:link w:val="BalloonTextChar"/>
+    <w:basedOn w:val="Normalny"/>
+    <w:link w:val="TekstdymkaZnak"/>
     <w:uiPriority w:val="99"/>
     <w:semiHidden/>
     <w:unhideWhenUsed/>
@@ -3089,10 +3190,10 @@
       <w:szCs w:val="18"/>
     </w:rPr>
   </w:style>
-  <w:style w:type="character" w:customStyle="1" w:styleId="BalloonTextChar">
-    <w:name w:val="Balloon Text Char"/>
-    <w:basedOn w:val="DefaultParagraphFont"/>
-    <w:link w:val="BalloonText"/>
+  <w:style w:type="character" w:customStyle="1" w:styleId="TekstdymkaZnak">
+    <w:name w:val="Tekst dymka Znak"/>
+    <w:basedOn w:val="Domylnaczcionkaakapitu"/>
+    <w:link w:val="Tekstdymka"/>
     <w:uiPriority w:val="99"/>
     <w:semiHidden/>
     <w:rsid w:val="00B03EA0"/>
@@ -3102,9 +3203,9 @@
       <w:szCs w:val="18"/>
     </w:rPr>
   </w:style>
-  <w:style w:type="character" w:styleId="Hyperlink">
+  <w:style w:type="character" w:styleId="Hipercze">
     <w:name w:val="Hyperlink"/>
-    <w:basedOn w:val="DefaultParagraphFont"/>
+    <w:basedOn w:val="Domylnaczcionkaakapitu"/>
     <w:uiPriority w:val="99"/>
     <w:unhideWhenUsed/>
     <w:rsid w:val="00B537B9"/>
@@ -3113,11 +3214,11 @@
       <w:u w:val="single"/>
     </w:rPr>
   </w:style>
-  <w:style w:type="paragraph" w:styleId="Title">
+  <w:style w:type="paragraph" w:styleId="Tytu">
     <w:name w:val="Title"/>
-    <w:basedOn w:val="Normal"/>
-    <w:next w:val="Normal"/>
-    <w:link w:val="TitleChar"/>
+    <w:basedOn w:val="Normalny"/>
+    <w:next w:val="Normalny"/>
+    <w:link w:val="TytuZnak"/>
     <w:uiPriority w:val="10"/>
     <w:qFormat/>
     <w:rsid w:val="00B537B9"/>
@@ -3134,10 +3235,10 @@
       <w:lang w:val="es-ES_tradnl" w:eastAsia="es-ES"/>
     </w:rPr>
   </w:style>
-  <w:style w:type="character" w:customStyle="1" w:styleId="TitleChar">
-    <w:name w:val="Title Char"/>
-    <w:basedOn w:val="DefaultParagraphFont"/>
-    <w:link w:val="Title"/>
+  <w:style w:type="character" w:customStyle="1" w:styleId="TytuZnak">
+    <w:name w:val="Tytuł Znak"/>
+    <w:basedOn w:val="Domylnaczcionkaakapitu"/>
+    <w:link w:val="Tytu"/>
     <w:uiPriority w:val="10"/>
     <w:rsid w:val="00B537B9"/>
     <w:rPr>
@@ -3149,9 +3250,9 @@
       <w:lang w:val="es-ES_tradnl" w:eastAsia="es-ES"/>
     </w:rPr>
   </w:style>
-  <w:style w:type="character" w:styleId="UnresolvedMention">
+  <w:style w:type="character" w:styleId="Nierozpoznanawzmianka">
     <w:name w:val="Unresolved Mention"/>
-    <w:basedOn w:val="DefaultParagraphFont"/>
+    <w:basedOn w:val="Domylnaczcionkaakapitu"/>
     <w:uiPriority w:val="99"/>
     <w:semiHidden/>
     <w:unhideWhenUsed/>

</xml_diff>